<commit_message>
Deploy simternship build 2026-08-28
</commit_message>
<xml_diff>
--- a/hub/files/PA0-PA1.docx
+++ b/hub/files/PA0-PA1.docx
@@ -37,7 +37,7 @@
                 <w:b/>
                 <w:sz w:val="19"/>
               </w:rPr>
-              <w:t>Due</w:t>
+              <w:t>Points</w:t>
             </w:r>
           </w:p>
         </w:tc>
@@ -57,7 +57,45 @@
                 <w:b/>
                 <w:sz w:val="19"/>
               </w:rPr>
-              <w:t>Sunday Aug 30, 11:59 PM</w:t>
+              <w:t>Completion (required — an unsigned team can't earn team grades)</w:t>
+            </w:r>
+          </w:p>
+        </w:tc>
+      </w:tr>
+      <w:tr>
+        <w:tc>
+          <w:tcPr>
+            <w:tcW w:type="dxa" w:w="4968"/>
+          </w:tcPr>
+          <w:p>
+            <w:r>
+              <w:rPr>
+                <w:sz w:val="19"/>
+              </w:rPr>
+            </w:r>
+            <w:r>
+              <w:rPr>
+                <w:sz w:val="19"/>
+              </w:rPr>
+              <w:t>Due</w:t>
+            </w:r>
+          </w:p>
+        </w:tc>
+        <w:tc>
+          <w:tcPr>
+            <w:tcW w:type="dxa" w:w="4968"/>
+          </w:tcPr>
+          <w:p>
+            <w:r>
+              <w:rPr>
+                <w:sz w:val="19"/>
+              </w:rPr>
+            </w:r>
+            <w:r>
+              <w:rPr>
+                <w:sz w:val="19"/>
+              </w:rPr>
+              <w:t>Sunday Sep 6, 11:59 PM</w:t>
             </w:r>
           </w:p>
         </w:tc>

</xml_diff>